<commit_message>
docs: update delivery manuals and HDF5 guide
</commit_message>
<xml_diff>
--- a/docs/UI_USER_MANUAL.docx
+++ b/docs/UI_USER_MANUAL.docx
@@ -31,26 +31,7 @@
         <w:spacing w:after="120" w:line="300" w:lineRule="auto"/>
       </w:pPr>
       <w:r>
-        <w:rPr>
-          <w:rFonts w:ascii="Noto Sans CJK SC" w:hAnsi="Noto Sans CJK SC" w:eastAsia="Noto Sans CJK SC"/>
-          <w:sz w:val="21"/>
-        </w:rPr>
-        <w:t xml:space="preserve">本手册介绍 </w:t>
-      </w:r>
-      <w:r>
-        <w:rPr>
-          <w:rFonts w:ascii="DejaVu Sans Mono" w:hAnsi="DejaVu Sans Mono" w:eastAsia="DejaVu Sans Mono"/>
-          <w:color w:val="333333"/>
-          <w:sz w:val="19"/>
-        </w:rPr>
-        <w:t>data_collection_rviz_panel</w:t>
-      </w:r>
-      <w:r>
-        <w:rPr>
-          <w:rFonts w:ascii="Noto Sans CJK SC" w:hAnsi="Noto Sans CJK SC" w:eastAsia="Noto Sans CJK SC"/>
-          <w:sz w:val="21"/>
-        </w:rPr>
-        <w:t xml:space="preserve"> 提供的 Qt/RViz2 操作界面，覆盖启动前检查、窗口布局、模式管理、数据采集、结果标注、数据清洗、LeRobot 转换、只读回放、状态诊断和常见故障处理。</w:t>
+        <w:t>本手册介绍 data_collection_rviz_panel 提供的 Qt/RViz2 操作界面，覆盖启动前检查、窗口布局、模式管理、数据采集、结果标注、数据清洗、ACT/VLA/HDF5 转换、只读回放、状态诊断和常见故障处理。</w:t>
       </w:r>
     </w:p>
     <w:p>
@@ -4533,14 +4514,8 @@
             <w:pPr>
               <w:spacing w:after="20" w:line="252" w:lineRule="auto"/>
             </w:pPr>
-            <w:r/>
             <w:r>
-              <w:rPr>
-                <w:rFonts w:ascii="DejaVu Sans Mono" w:hAnsi="DejaVu Sans Mono" w:eastAsia="DejaVu Sans Mono"/>
-                <w:color w:val="333333"/>
-                <w:sz w:val="19"/>
-              </w:rPr>
-              <w:t>Convert LeRobot...</w:t>
+              <w:t>Convert...</w:t>
             </w:r>
           </w:p>
         </w:tc>
@@ -4559,13 +4534,8 @@
             <w:pPr>
               <w:spacing w:after="20" w:line="252" w:lineRule="auto"/>
             </w:pPr>
-            <w:r/>
             <w:r>
-              <w:rPr>
-                <w:rFonts w:ascii="Noto Sans CJK SC" w:hAnsi="Noto Sans CJK SC" w:eastAsia="Noto Sans CJK SC"/>
-                <w:sz w:val="18"/>
-              </w:rPr>
-              <w:t>单独选择 cleaned 数据集并导出 ACT 或 VLA</w:t>
+              <w:t>单独选择 cleaned 数据集并导出 ACT、VLA 或 HDF5</w:t>
             </w:r>
           </w:p>
         </w:tc>
@@ -6045,11 +6015,7 @@
         <w:pStyle w:val="Heading2"/>
       </w:pPr>
       <w:r>
-        <w:rPr>
-          <w:rFonts w:ascii="Noto Sans CJK SC" w:hAnsi="Noto Sans CJK SC" w:eastAsia="Noto Sans CJK SC"/>
-          <w:sz w:val="26"/>
-        </w:rPr>
-        <w:t>13. Convert LeRobot</w:t>
+        <w:t>13. Convert（ACT / VLA / HDF5）</w:t>
       </w:r>
     </w:p>
     <w:p>
@@ -6070,11 +6036,20 @@
         <w:spacing w:after="80" w:line="288" w:lineRule="auto"/>
       </w:pPr>
       <w:r>
+        <w:t>点击 Convert...。</w:t>
+      </w:r>
+    </w:p>
+    <w:p>
+      <w:pPr>
+        <w:pStyle w:val="ListNumber"/>
+        <w:spacing w:after="80" w:line="288" w:lineRule="auto"/>
+      </w:pPr>
+      <w:r>
         <w:rPr>
           <w:rFonts w:ascii="Noto Sans CJK SC" w:hAnsi="Noto Sans CJK SC" w:eastAsia="Noto Sans CJK SC"/>
           <w:sz w:val="20"/>
         </w:rPr>
-        <w:t xml:space="preserve">点击 </w:t>
+        <w:t xml:space="preserve">选择 cleaned </w:t>
       </w:r>
       <w:r>
         <w:rPr>
@@ -6082,27 +6057,14 @@
           <w:color w:val="333333"/>
           <w:sz w:val="19"/>
         </w:rPr>
-        <w:t>Convert LeRobot...</w:t>
+        <w:t>qpos_gripper</w:t>
       </w:r>
       <w:r>
         <w:rPr>
           <w:rFonts w:ascii="Noto Sans CJK SC" w:hAnsi="Noto Sans CJK SC" w:eastAsia="Noto Sans CJK SC"/>
           <w:sz w:val="20"/>
         </w:rPr>
-        <w:t>。</w:t>
-      </w:r>
-    </w:p>
-    <w:p>
-      <w:pPr>
-        <w:pStyle w:val="ListNumber"/>
-        <w:spacing w:after="80" w:line="288" w:lineRule="auto"/>
-      </w:pPr>
-      <w:r>
-        <w:rPr>
-          <w:rFonts w:ascii="Noto Sans CJK SC" w:hAnsi="Noto Sans CJK SC" w:eastAsia="Noto Sans CJK SC"/>
-          <w:sz w:val="20"/>
-        </w:rPr>
-        <w:t xml:space="preserve">选择 cleaned </w:t>
+        <w:t xml:space="preserve"> 数据集，必须包含 </w:t>
       </w:r>
       <w:r>
         <w:rPr>
@@ -6110,14 +6072,79 @@
           <w:color w:val="333333"/>
           <w:sz w:val="19"/>
         </w:rPr>
-        <w:t>qpos_gripper</w:t>
+        <w:t>meta/episodes.jsonl</w:t>
       </w:r>
       <w:r>
         <w:rPr>
           <w:rFonts w:ascii="Noto Sans CJK SC" w:hAnsi="Noto Sans CJK SC" w:eastAsia="Noto Sans CJK SC"/>
           <w:sz w:val="20"/>
         </w:rPr>
-        <w:t xml:space="preserve"> 数据集，必须包含 </w:t>
+        <w:t>。</w:t>
+      </w:r>
+    </w:p>
+    <w:p>
+      <w:pPr>
+        <w:pStyle w:val="ListNumber"/>
+        <w:spacing w:after="80" w:line="288" w:lineRule="auto"/>
+      </w:pPr>
+      <w:r>
+        <w:t>ACT/VLA 选择输出父目录和输出目录名；HDF5 直接选择输出文件，文件名不带扩展名时 UI 自动补充 .hdf5。</w:t>
+      </w:r>
+    </w:p>
+    <w:p>
+      <w:pPr>
+        <w:pStyle w:val="ListNumber"/>
+        <w:spacing w:after="80" w:line="288" w:lineRule="auto"/>
+      </w:pPr>
+      <w:r>
+        <w:t>ACT、VLA 或 HDF5 三种格式均可选择。</w:t>
+      </w:r>
+    </w:p>
+    <w:p>
+      <w:pPr>
+        <w:pStyle w:val="ListNumber"/>
+        <w:spacing w:after="80" w:line="288" w:lineRule="auto"/>
+      </w:pPr>
+      <w:r>
+        <w:t>ACT 直接进入异步导出；VLA 先显示 preflight 结果；HDF5 检查输入元数据后进入异步导出。</w:t>
+      </w:r>
+    </w:p>
+    <w:p>
+      <w:pPr>
+        <w:pStyle w:val="ListNumber"/>
+        <w:spacing w:after="80" w:line="288" w:lineRule="auto"/>
+      </w:pPr>
+      <w:r>
+        <w:rPr>
+          <w:rFonts w:ascii="Noto Sans CJK SC" w:hAnsi="Noto Sans CJK SC" w:eastAsia="Noto Sans CJK SC"/>
+          <w:sz w:val="20"/>
+        </w:rPr>
+        <w:t>VLA 确认 eligible/skipped episode 和计划报告后开始导出。</w:t>
+      </w:r>
+    </w:p>
+    <w:p>
+      <w:pPr>
+        <w:pStyle w:val="ListNumber"/>
+        <w:spacing w:after="80" w:line="288" w:lineRule="auto"/>
+      </w:pPr>
+      <w:r>
+        <w:rPr>
+          <w:rFonts w:ascii="Noto Sans CJK SC" w:hAnsi="Noto Sans CJK SC" w:eastAsia="Noto Sans CJK SC"/>
+          <w:sz w:val="20"/>
+        </w:rPr>
+        <w:t>观察状态文字和不确定进度条；完成或失败后进度条停止。</w:t>
+      </w:r>
+    </w:p>
+    <w:p>
+      <w:pPr>
+        <w:spacing w:after="120" w:line="300" w:lineRule="auto"/>
+      </w:pPr>
+      <w:r>
+        <w:rPr>
+          <w:rFonts w:ascii="Noto Sans CJK SC" w:hAnsi="Noto Sans CJK SC" w:eastAsia="Noto Sans CJK SC"/>
+          <w:sz w:val="21"/>
+        </w:rPr>
+        <w:t xml:space="preserve">转换状态使用 </w:t>
       </w:r>
       <w:r>
         <w:rPr>
@@ -6125,40 +6152,14 @@
           <w:color w:val="333333"/>
           <w:sz w:val="19"/>
         </w:rPr>
-        <w:t>meta/episodes.jsonl</w:t>
-      </w:r>
-      <w:r>
-        <w:rPr>
-          <w:rFonts w:ascii="Noto Sans CJK SC" w:hAnsi="Noto Sans CJK SC" w:eastAsia="Noto Sans CJK SC"/>
-          <w:sz w:val="20"/>
-        </w:rPr>
-        <w:t>。</w:t>
-      </w:r>
-    </w:p>
-    <w:p>
-      <w:pPr>
-        <w:pStyle w:val="ListNumber"/>
-        <w:spacing w:after="80" w:line="288" w:lineRule="auto"/>
-      </w:pPr>
-      <w:r>
-        <w:rPr>
-          <w:rFonts w:ascii="Noto Sans CJK SC" w:hAnsi="Noto Sans CJK SC" w:eastAsia="Noto Sans CJK SC"/>
-          <w:sz w:val="20"/>
-        </w:rPr>
-        <w:t>选择输出父目录和输出目录名。</w:t>
-      </w:r>
-    </w:p>
-    <w:p>
-      <w:pPr>
-        <w:pStyle w:val="ListNumber"/>
-        <w:spacing w:after="80" w:line="288" w:lineRule="auto"/>
-      </w:pPr>
-      <w:r>
-        <w:rPr>
-          <w:rFonts w:ascii="Noto Sans CJK SC" w:hAnsi="Noto Sans CJK SC" w:eastAsia="Noto Sans CJK SC"/>
-          <w:sz w:val="20"/>
-        </w:rPr>
-        <w:t xml:space="preserve">选择 </w:t>
+        <w:t>queued</w:t>
+      </w:r>
+      <w:r>
+        <w:rPr>
+          <w:rFonts w:ascii="Noto Sans CJK SC" w:hAnsi="Noto Sans CJK SC" w:eastAsia="Noto Sans CJK SC"/>
+          <w:sz w:val="21"/>
+        </w:rPr>
+        <w:t>、</w:t>
       </w:r>
       <w:r>
         <w:rPr>
@@ -6166,14 +6167,14 @@
           <w:color w:val="333333"/>
           <w:sz w:val="19"/>
         </w:rPr>
-        <w:t>ACT</w:t>
-      </w:r>
-      <w:r>
-        <w:rPr>
-          <w:rFonts w:ascii="Noto Sans CJK SC" w:hAnsi="Noto Sans CJK SC" w:eastAsia="Noto Sans CJK SC"/>
-          <w:sz w:val="20"/>
-        </w:rPr>
-        <w:t xml:space="preserve"> 或 </w:t>
+        <w:t>running</w:t>
+      </w:r>
+      <w:r>
+        <w:rPr>
+          <w:rFonts w:ascii="Noto Sans CJK SC" w:hAnsi="Noto Sans CJK SC" w:eastAsia="Noto Sans CJK SC"/>
+          <w:sz w:val="21"/>
+        </w:rPr>
+        <w:t>、</w:t>
       </w:r>
       <w:r>
         <w:rPr>
@@ -6181,65 +6182,14 @@
           <w:color w:val="333333"/>
           <w:sz w:val="19"/>
         </w:rPr>
-        <w:t>VLA</w:t>
-      </w:r>
-      <w:r>
-        <w:rPr>
-          <w:rFonts w:ascii="Noto Sans CJK SC" w:hAnsi="Noto Sans CJK SC" w:eastAsia="Noto Sans CJK SC"/>
-          <w:sz w:val="20"/>
-        </w:rPr>
-        <w:t>。</w:t>
-      </w:r>
-    </w:p>
-    <w:p>
-      <w:pPr>
-        <w:pStyle w:val="ListNumber"/>
-        <w:spacing w:after="80" w:line="288" w:lineRule="auto"/>
-      </w:pPr>
-      <w:r>
-        <w:rPr>
-          <w:rFonts w:ascii="Noto Sans CJK SC" w:hAnsi="Noto Sans CJK SC" w:eastAsia="Noto Sans CJK SC"/>
-          <w:sz w:val="20"/>
-        </w:rPr>
-        <w:t>ACT 直接进入异步导出；VLA 先显示 preflight 结果。</w:t>
-      </w:r>
-    </w:p>
-    <w:p>
-      <w:pPr>
-        <w:pStyle w:val="ListNumber"/>
-        <w:spacing w:after="80" w:line="288" w:lineRule="auto"/>
-      </w:pPr>
-      <w:r>
-        <w:rPr>
-          <w:rFonts w:ascii="Noto Sans CJK SC" w:hAnsi="Noto Sans CJK SC" w:eastAsia="Noto Sans CJK SC"/>
-          <w:sz w:val="20"/>
-        </w:rPr>
-        <w:t>VLA 确认 eligible/skipped episode 和计划报告后开始导出。</w:t>
-      </w:r>
-    </w:p>
-    <w:p>
-      <w:pPr>
-        <w:pStyle w:val="ListNumber"/>
-        <w:spacing w:after="80" w:line="288" w:lineRule="auto"/>
-      </w:pPr>
-      <w:r>
-        <w:rPr>
-          <w:rFonts w:ascii="Noto Sans CJK SC" w:hAnsi="Noto Sans CJK SC" w:eastAsia="Noto Sans CJK SC"/>
-          <w:sz w:val="20"/>
-        </w:rPr>
-        <w:t>观察状态文字和不确定进度条；完成或失败后进度条停止。</w:t>
-      </w:r>
-    </w:p>
-    <w:p>
-      <w:pPr>
-        <w:spacing w:after="120" w:line="300" w:lineRule="auto"/>
-      </w:pPr>
+        <w:t>done</w:t>
+      </w:r>
       <w:r>
         <w:rPr>
           <w:rFonts w:ascii="Noto Sans CJK SC" w:hAnsi="Noto Sans CJK SC" w:eastAsia="Noto Sans CJK SC"/>
           <w:sz w:val="21"/>
         </w:rPr>
-        <w:t xml:space="preserve">转换状态使用 </w:t>
+        <w:t>、</w:t>
       </w:r>
       <w:r>
         <w:rPr>
@@ -6247,51 +6197,6 @@
           <w:color w:val="333333"/>
           <w:sz w:val="19"/>
         </w:rPr>
-        <w:t>queued</w:t>
-      </w:r>
-      <w:r>
-        <w:rPr>
-          <w:rFonts w:ascii="Noto Sans CJK SC" w:hAnsi="Noto Sans CJK SC" w:eastAsia="Noto Sans CJK SC"/>
-          <w:sz w:val="21"/>
-        </w:rPr>
-        <w:t>、</w:t>
-      </w:r>
-      <w:r>
-        <w:rPr>
-          <w:rFonts w:ascii="DejaVu Sans Mono" w:hAnsi="DejaVu Sans Mono" w:eastAsia="DejaVu Sans Mono"/>
-          <w:color w:val="333333"/>
-          <w:sz w:val="19"/>
-        </w:rPr>
-        <w:t>running</w:t>
-      </w:r>
-      <w:r>
-        <w:rPr>
-          <w:rFonts w:ascii="Noto Sans CJK SC" w:hAnsi="Noto Sans CJK SC" w:eastAsia="Noto Sans CJK SC"/>
-          <w:sz w:val="21"/>
-        </w:rPr>
-        <w:t>、</w:t>
-      </w:r>
-      <w:r>
-        <w:rPr>
-          <w:rFonts w:ascii="DejaVu Sans Mono" w:hAnsi="DejaVu Sans Mono" w:eastAsia="DejaVu Sans Mono"/>
-          <w:color w:val="333333"/>
-          <w:sz w:val="19"/>
-        </w:rPr>
-        <w:t>done</w:t>
-      </w:r>
-      <w:r>
-        <w:rPr>
-          <w:rFonts w:ascii="Noto Sans CJK SC" w:hAnsi="Noto Sans CJK SC" w:eastAsia="Noto Sans CJK SC"/>
-          <w:sz w:val="21"/>
-        </w:rPr>
-        <w:t>、</w:t>
-      </w:r>
-      <w:r>
-        <w:rPr>
-          <w:rFonts w:ascii="DejaVu Sans Mono" w:hAnsi="DejaVu Sans Mono" w:eastAsia="DejaVu Sans Mono"/>
-          <w:color w:val="333333"/>
-          <w:sz w:val="19"/>
-        </w:rPr>
         <w:t>failed</w:t>
       </w:r>
       <w:r>
@@ -6309,18 +6214,13 @@
         <w:shd w:fill="F3F5F7"/>
       </w:pPr>
       <w:r>
-        <w:rPr>
-          <w:rFonts w:ascii="DejaVu Sans Mono" w:hAnsi="DejaVu Sans Mono" w:eastAsia="DejaVu Sans Mono"/>
-          <w:color w:val="333333"/>
-          <w:sz w:val="18"/>
-        </w:rPr>
-        <w:t>ACT export queued...</w:t>
+        <w:t>HDF5 export queued...</w:t>
         <w:br/>
-        <w:t>ACT export running...</w:t>
+        <w:t>HDF5 export running...</w:t>
         <w:br/>
-        <w:t>ACT export complete: ...</w:t>
+        <w:t>HDF5 export complete: ...</w:t>
         <w:br/>
-        <w:t>ACT export failed: ...</w:t>
+        <w:t>HDF5 export failed: ...</w:t>
       </w:r>
     </w:p>
     <w:p>
@@ -6328,11 +6228,7 @@
         <w:spacing w:after="120" w:line="300" w:lineRule="auto"/>
       </w:pPr>
       <w:r>
-        <w:rPr>
-          <w:rFonts w:ascii="Noto Sans CJK SC" w:hAnsi="Noto Sans CJK SC" w:eastAsia="Noto Sans CJK SC"/>
-          <w:sz w:val="21"/>
-        </w:rPr>
-        <w:t>VLA 需要有效语言标注；没有语言的 episode 会在 preflight 中列为 skipped。ACT 与 VLA 使用同一 LeRobot v3 输出结构，后续验证和回放接口不因 profile 改变。</w:t>
+        <w:t>ACT/VLA 输出 LeRobot v3 目录；HDF5 输出项目自定义 HDF5 v1 单文件，包含 state/action、时间戳、双路 RGB 图像、episode 索引和语言元数据，不宣称兼容任意训练框架。VLA 需要有效语言标注；没有语言的 episode 会在 preflight 中列为 skipped。HDF5 使用项目自定义 schema，使用前应确认下游读取器按该 schema 读取。</w:t>
       </w:r>
     </w:p>
     <w:p>
@@ -6427,25 +6323,9 @@
         <w:tc>
           <w:tcPr>
             <w:tcW w:type="dxa" w:w="2700"/>
-            <w:vAlign w:val="center"/>
-            <w:tcMar>
-              <w:top w:w="80" w:type="dxa"/>
-              <w:start w:w="120" w:type="dxa"/>
-              <w:bottom w:w="80" w:type="dxa"/>
-              <w:end w:w="120" w:type="dxa"/>
-            </w:tcMar>
           </w:tcPr>
           <w:p>
-            <w:pPr>
-              <w:spacing w:after="20" w:line="252" w:lineRule="auto"/>
-            </w:pPr>
-            <w:r/>
             <w:r>
-              <w:rPr>
-                <w:rFonts w:ascii="DejaVu Sans Mono" w:hAnsi="DejaVu Sans Mono" w:eastAsia="DejaVu Sans Mono"/>
-                <w:color w:val="333333"/>
-                <w:sz w:val="19"/>
-              </w:rPr>
               <w:t>POST /api/capture/export-lerobot/preflight</w:t>
             </w:r>
           </w:p>
@@ -6453,24 +6333,9 @@
         <w:tc>
           <w:tcPr>
             <w:tcW w:type="dxa" w:w="6660"/>
-            <w:vAlign w:val="center"/>
-            <w:tcMar>
-              <w:top w:w="80" w:type="dxa"/>
-              <w:start w:w="120" w:type="dxa"/>
-              <w:bottom w:w="80" w:type="dxa"/>
-              <w:end w:w="120" w:type="dxa"/>
-            </w:tcMar>
           </w:tcPr>
           <w:p>
-            <w:pPr>
-              <w:spacing w:after="20" w:line="252" w:lineRule="auto"/>
-            </w:pPr>
-            <w:r/>
             <w:r>
-              <w:rPr>
-                <w:rFonts w:ascii="Noto Sans CJK SC" w:hAnsi="Noto Sans CJK SC" w:eastAsia="Noto Sans CJK SC"/>
-                <w:sz w:val="18"/>
-              </w:rPr>
               <w:t>VLA 导出前检查</w:t>
             </w:r>
           </w:p>
@@ -6480,25 +6345,9 @@
         <w:tc>
           <w:tcPr>
             <w:tcW w:type="dxa" w:w="2700"/>
-            <w:vAlign w:val="center"/>
-            <w:tcMar>
-              <w:top w:w="80" w:type="dxa"/>
-              <w:start w:w="120" w:type="dxa"/>
-              <w:bottom w:w="80" w:type="dxa"/>
-              <w:end w:w="120" w:type="dxa"/>
-            </w:tcMar>
           </w:tcPr>
           <w:p>
-            <w:pPr>
-              <w:spacing w:after="20" w:line="252" w:lineRule="auto"/>
-            </w:pPr>
-            <w:r/>
             <w:r>
-              <w:rPr>
-                <w:rFonts w:ascii="DejaVu Sans Mono" w:hAnsi="DejaVu Sans Mono" w:eastAsia="DejaVu Sans Mono"/>
-                <w:color w:val="333333"/>
-                <w:sz w:val="19"/>
-              </w:rPr>
               <w:t>POST /api/capture/export-lerobot</w:t>
             </w:r>
           </w:p>
@@ -6506,25 +6355,10 @@
         <w:tc>
           <w:tcPr>
             <w:tcW w:type="dxa" w:w="6660"/>
-            <w:vAlign w:val="center"/>
-            <w:tcMar>
-              <w:top w:w="80" w:type="dxa"/>
-              <w:start w:w="120" w:type="dxa"/>
-              <w:bottom w:w="80" w:type="dxa"/>
-              <w:end w:w="120" w:type="dxa"/>
-            </w:tcMar>
           </w:tcPr>
           <w:p>
-            <w:pPr>
-              <w:spacing w:after="20" w:line="252" w:lineRule="auto"/>
-            </w:pPr>
-            <w:r/>
             <w:r>
-              <w:rPr>
-                <w:rFonts w:ascii="Noto Sans CJK SC" w:hAnsi="Noto Sans CJK SC" w:eastAsia="Noto Sans CJK SC"/>
-                <w:sz w:val="18"/>
-              </w:rPr>
-              <w:t>启动异步转换</w:t>
+              <w:t>启动 ACT/VLA LeRobot 异步转换（兼容接口）</w:t>
             </w:r>
           </w:p>
         </w:tc>
@@ -6533,25 +6367,9 @@
         <w:tc>
           <w:tcPr>
             <w:tcW w:type="dxa" w:w="2700"/>
-            <w:vAlign w:val="center"/>
-            <w:tcMar>
-              <w:top w:w="80" w:type="dxa"/>
-              <w:start w:w="120" w:type="dxa"/>
-              <w:bottom w:w="80" w:type="dxa"/>
-              <w:end w:w="120" w:type="dxa"/>
-            </w:tcMar>
           </w:tcPr>
           <w:p>
-            <w:pPr>
-              <w:spacing w:after="20" w:line="252" w:lineRule="auto"/>
-            </w:pPr>
-            <w:r/>
             <w:r>
-              <w:rPr>
-                <w:rFonts w:ascii="DejaVu Sans Mono" w:hAnsi="DejaVu Sans Mono" w:eastAsia="DejaVu Sans Mono"/>
-                <w:color w:val="333333"/>
-                <w:sz w:val="19"/>
-              </w:rPr>
               <w:t>GET /api/capture/export-lerobot/status</w:t>
             </w:r>
           </w:p>
@@ -6559,25 +6377,54 @@
         <w:tc>
           <w:tcPr>
             <w:tcW w:type="dxa" w:w="6660"/>
-            <w:vAlign w:val="center"/>
-            <w:tcMar>
-              <w:top w:w="80" w:type="dxa"/>
-              <w:start w:w="120" w:type="dxa"/>
-              <w:bottom w:w="80" w:type="dxa"/>
-              <w:end w:w="120" w:type="dxa"/>
-            </w:tcMar>
           </w:tcPr>
           <w:p>
-            <w:pPr>
-              <w:spacing w:after="20" w:line="252" w:lineRule="auto"/>
-            </w:pPr>
-            <w:r/>
             <w:r>
-              <w:rPr>
-                <w:rFonts w:ascii="Noto Sans CJK SC" w:hAnsi="Noto Sans CJK SC" w:eastAsia="Noto Sans CJK SC"/>
-                <w:sz w:val="18"/>
-              </w:rPr>
-              <w:t>查询转换状态</w:t>
+              <w:t>查询兼容接口转换状态</w:t>
+            </w:r>
+          </w:p>
+        </w:tc>
+      </w:tr>
+      <w:tr>
+        <w:tc>
+          <w:tcPr>
+            <w:tcW w:type="dxa" w:w="2700"/>
+          </w:tcPr>
+          <w:p>
+            <w:r>
+              <w:t>POST /api/capture/export</w:t>
+            </w:r>
+          </w:p>
+        </w:tc>
+        <w:tc>
+          <w:tcPr>
+            <w:tcW w:type="dxa" w:w="6660"/>
+          </w:tcPr>
+          <w:p>
+            <w:r>
+              <w:t>按 format=act|vla|hdf5 启动通用异步转换</w:t>
+            </w:r>
+          </w:p>
+        </w:tc>
+      </w:tr>
+      <w:tr>
+        <w:tc>
+          <w:tcPr>
+            <w:tcW w:type="dxa" w:w="2700"/>
+          </w:tcPr>
+          <w:p>
+            <w:r>
+              <w:t>GET /api/capture/export/status</w:t>
+            </w:r>
+          </w:p>
+        </w:tc>
+        <w:tc>
+          <w:tcPr>
+            <w:tcW w:type="dxa" w:w="6660"/>
+          </w:tcPr>
+          <w:p>
+            <w:r>
+              <w:t>查询通用转换状态</w:t>
             </w:r>
           </w:p>
         </w:tc>
@@ -10711,6 +10558,102 @@
           </w:p>
         </w:tc>
       </w:tr>
+      <w:tr>
+        <w:tc>
+          <w:tcPr>
+            <w:tcW w:type="dxa" w:w="1450"/>
+          </w:tcPr>
+          <w:p>
+            <w:r>
+              <w:t>POST</w:t>
+            </w:r>
+          </w:p>
+        </w:tc>
+        <w:tc>
+          <w:tcPr>
+            <w:tcW w:type="dxa" w:w="2900"/>
+          </w:tcPr>
+          <w:p>
+            <w:r>
+              <w:t>/api/capture/export</w:t>
+            </w:r>
+          </w:p>
+        </w:tc>
+        <w:tc>
+          <w:tcPr>
+            <w:tcW w:type="dxa" w:w="5010"/>
+          </w:tcPr>
+          <w:p>
+            <w:r>
+              <w:t>按 format=act|vla|hdf5 启动通用异步转换</w:t>
+            </w:r>
+          </w:p>
+        </w:tc>
+      </w:tr>
+      <w:tr>
+        <w:tc>
+          <w:tcPr>
+            <w:tcW w:type="dxa" w:w="1450"/>
+          </w:tcPr>
+          <w:p>
+            <w:r>
+              <w:t>GET</w:t>
+            </w:r>
+          </w:p>
+        </w:tc>
+        <w:tc>
+          <w:tcPr>
+            <w:tcW w:type="dxa" w:w="2900"/>
+          </w:tcPr>
+          <w:p>
+            <w:r>
+              <w:t>/api/capture/export/status</w:t>
+            </w:r>
+          </w:p>
+        </w:tc>
+        <w:tc>
+          <w:tcPr>
+            <w:tcW w:type="dxa" w:w="5010"/>
+          </w:tcPr>
+          <w:p>
+            <w:r>
+              <w:t>查询通用转换状态</w:t>
+            </w:r>
+          </w:p>
+        </w:tc>
+      </w:tr>
+      <w:tr>
+        <w:tc>
+          <w:tcPr>
+            <w:tcW w:type="dxa" w:w="1450"/>
+          </w:tcPr>
+          <w:p>
+            <w:r>
+              <w:t>POST</w:t>
+            </w:r>
+          </w:p>
+        </w:tc>
+        <w:tc>
+          <w:tcPr>
+            <w:tcW w:type="dxa" w:w="2900"/>
+          </w:tcPr>
+          <w:p>
+            <w:r>
+              <w:t>/api/capture/export/preflight</w:t>
+            </w:r>
+          </w:p>
+        </w:tc>
+        <w:tc>
+          <w:tcPr>
+            <w:tcW w:type="dxa" w:w="5010"/>
+          </w:tcPr>
+          <w:p>
+            <w:r>
+              <w:t>检查通用导出参数；HDF5 检查输入和输出路径</w:t>
+            </w:r>
+          </w:p>
+        </w:tc>
+      </w:tr>
     </w:tbl>
     <w:p>
       <w:pPr>
@@ -11466,11 +11409,6 @@
         <w:shd w:fill="F3F5F7"/>
       </w:pPr>
       <w:r>
-        <w:rPr>
-          <w:rFonts w:ascii="DejaVu Sans Mono" w:hAnsi="DejaVu Sans Mono" w:eastAsia="DejaVu Sans Mono"/>
-          <w:color w:val="333333"/>
-          <w:sz w:val="18"/>
-        </w:rPr>
         <w:t>启动驱动与模式管理器</w:t>
         <w:br/>
         <w:t xml:space="preserve">        ↓</w:t>
@@ -11503,7 +11441,7 @@
         <w:br/>
         <w:t xml:space="preserve">        ↓</w:t>
         <w:br/>
-        <w:t>Convert LeRobot → ACT 或 VLA preflight/导出</w:t>
+        <w:t>Convert → ACT、VLA 或 HDF5 导出</w:t>
         <w:br/>
         <w:t xml:space="preserve">        ↓</w:t>
         <w:br/>
@@ -11520,6 +11458,108 @@
           <w:sz w:val="21"/>
         </w:rPr>
         <w:t>完成上述流程后，original、cleaned 和 LeRobot 数据集可以分别用于原始归档、质量筛选和训练/验证。任何异常都应先保留原始数据和报告，再进行修复或重新采集。</w:t>
+      </w:r>
+    </w:p>
+    <w:p>
+      <w:pPr>
+        <w:pStyle w:val="Heading1"/>
+      </w:pPr>
+      <w:r>
+        <w:t>20. HDF5 转换补充说明</w:t>
+      </w:r>
+    </w:p>
+    <w:p>
+      <w:r>
+        <w:t>HDF5 是本项目定义的二进制交换格式，不是任意训练框架的通用输入。转换只读取 cleaned/&lt;mode&gt;/qpos_gripper，不参与实时采集、同步或清洗。若下游框架有自己的 HDF5 约定，需要另行编写适配器。</w:t>
+      </w:r>
+    </w:p>
+    <w:p>
+      <w:pPr>
+        <w:pStyle w:val="Heading2"/>
+      </w:pPr>
+      <w:r>
+        <w:t>20.1 界面操作</w:t>
+      </w:r>
+    </w:p>
+    <w:p>
+      <w:pPr>
+        <w:pStyle w:val="ListNumber"/>
+      </w:pPr>
+      <w:r>
+        <w:t>点击 Convert...，选择 HDF5。</w:t>
+      </w:r>
+    </w:p>
+    <w:p>
+      <w:pPr>
+        <w:pStyle w:val="ListNumber"/>
+      </w:pPr>
+      <w:r>
+        <w:t>选择包含 meta/episodes.jsonl 的 cleaned qpos_gripper 数据集。</w:t>
+      </w:r>
+    </w:p>
+    <w:p>
+      <w:pPr>
+        <w:pStyle w:val="ListNumber"/>
+      </w:pPr>
+      <w:r>
+        <w:t>选择输出文件；未填写扩展名时 UI 自动补充 .hdf5，已有文件不会覆盖。</w:t>
+      </w:r>
+    </w:p>
+    <w:p>
+      <w:pPr>
+        <w:pStyle w:val="ListNumber"/>
+      </w:pPr>
+      <w:r>
+        <w:t>观察 HDF5 export queued、HDF5 export running、HDF5 export complete 或 HDF5 export failed 状态。</w:t>
+      </w:r>
+    </w:p>
+    <w:p>
+      <w:pPr>
+        <w:pStyle w:val="Heading2"/>
+      </w:pPr>
+      <w:r>
+        <w:t>20.2 命令行与 API</w:t>
+      </w:r>
+    </w:p>
+    <w:p>
+      <w:r>
+        <w:t>命令行：ros2 run data_collection_pkg data_collection convert cleaned/teleop/qpos_gripper --format hdf5 --output-path exports/teleop.hdf5</w:t>
+      </w:r>
+    </w:p>
+    <w:p>
+      <w:r>
+        <w:t>API：POST /api/capture/export，请求字段为 format=hdf5、cleaned_dataset_dir 和 output_path；使用 GET /api/capture/export/status 查询 queued、running、done 或 failed。</w:t>
+      </w:r>
+    </w:p>
+    <w:p>
+      <w:pPr>
+        <w:pStyle w:val="Heading2"/>
+      </w:pPr>
+      <w:r>
+        <w:t>20.3 输出与校验</w:t>
+      </w:r>
+    </w:p>
+    <w:p>
+      <w:r>
+        <w:t>输出包含 meta/episode_index、episode_lengths、episode_ends、tasks，以及每个 episode 的 state、actions、timestamps、frame_index、top 和 wrist RGB 数组。图像统一为 uint8、THWC。</w:t>
+      </w:r>
+    </w:p>
+    <w:p>
+      <w:r>
+        <w:t>转换后使用 verify_hdf5_export 检查 schema、episode 数量、必需字段和长度一致性。校验通过表示符合项目 HDF5 v1，不表示自动兼容其他训练器。</w:t>
+      </w:r>
+    </w:p>
+    <w:p>
+      <w:pPr>
+        <w:pStyle w:val="Heading2"/>
+      </w:pPr>
+      <w:r>
+        <w:t>20.4 容量注意事项</w:t>
+      </w:r>
+    </w:p>
+    <w:p>
+      <w:r>
+        <w:t>RGB 数组比 JPEG 大很多。转换器逐帧解码并流式写入，避免把整个数据集加载到内存，但仍需预留足够磁盘空间。</w:t>
       </w:r>
     </w:p>
     <w:sectPr>

</xml_diff>